<commit_message>
Zeratul: Ambusher & Void Templar
- Доделана функциональная часть Ambusher'а
- Сделана способность Blink для Void Templar'а
 - Скачок Void Templar'а теперь наносит урон всем противникам на пути
</commit_message>
<xml_diff>
--- a/docs/ID Naming Standards.docx
+++ b/docs/ID Naming Standards.docx
@@ -64,9 +64,34 @@
         <w:t>Исправленная версия стандартной библиотеки совместного режима</w:t>
       </w:r>
     </w:p>
+    <w:p>
+      <w:pPr>
+        <w:jc w:val="center"/>
+        <w:rPr>
+          <w:rFonts w:asciiTheme="majorHAnsi" w:hAnsiTheme="majorHAnsi" w:cstheme="majorHAnsi"/>
+          <w:sz w:val="20"/>
+          <w:szCs w:val="20"/>
+        </w:rPr>
+      </w:pPr>
+      <w:r>
+        <w:rPr>
+          <w:rFonts w:asciiTheme="majorHAnsi" w:hAnsiTheme="majorHAnsi" w:cstheme="majorHAnsi"/>
+          <w:sz w:val="20"/>
+          <w:szCs w:val="20"/>
+        </w:rPr>
+        <w:t>Стандарты идентификаторов</w:t>
+      </w:r>
+    </w:p>
     <w:p/>
     <w:sdt>
       <w:sdtPr>
+        <w:rPr>
+          <w:rFonts w:asciiTheme="minorHAnsi" w:eastAsiaTheme="minorHAnsi" w:hAnsiTheme="minorHAnsi" w:cstheme="minorBidi"/>
+          <w:color w:val="auto"/>
+          <w:sz w:val="22"/>
+          <w:szCs w:val="22"/>
+          <w:lang w:eastAsia="en-US"/>
+        </w:rPr>
         <w:id w:val="-1552525948"/>
         <w:docPartObj>
           <w:docPartGallery w:val="Table of Contents"/>
@@ -75,13 +100,8 @@
       </w:sdtPr>
       <w:sdtEndPr>
         <w:rPr>
-          <w:rFonts w:asciiTheme="minorHAnsi" w:eastAsiaTheme="minorHAnsi" w:hAnsiTheme="minorHAnsi" w:cstheme="minorBidi"/>
           <w:b/>
           <w:bCs/>
-          <w:color w:val="auto"/>
-          <w:sz w:val="22"/>
-          <w:szCs w:val="22"/>
-          <w:lang w:eastAsia="en-US"/>
         </w:rPr>
       </w:sdtEndPr>
       <w:sdtContent>
@@ -100,7 +120,9 @@
               <w:tab w:val="right" w:leader="dot" w:pos="9345"/>
             </w:tabs>
             <w:rPr>
+              <w:rFonts w:eastAsiaTheme="minorEastAsia"/>
               <w:noProof/>
+              <w:lang w:eastAsia="ru-RU"/>
             </w:rPr>
           </w:pPr>
           <w:r>
@@ -112,7 +134,7 @@
           <w:r>
             <w:fldChar w:fldCharType="separate"/>
           </w:r>
-          <w:hyperlink w:anchor="_Toc206346798" w:history="1">
+          <w:hyperlink w:anchor="_Toc212746758" w:history="1">
             <w:r>
               <w:rPr>
                 <w:rStyle w:val="a5"/>
@@ -139,7 +161,7 @@
                 <w:noProof/>
                 <w:webHidden/>
               </w:rPr>
-              <w:instrText xml:space="preserve"> PAGEREF _Toc206346798 \h </w:instrText>
+              <w:instrText xml:space="preserve"> PAGEREF _Toc212746758 \h </w:instrText>
             </w:r>
             <w:r>
               <w:rPr>
@@ -177,30 +199,18 @@
               <w:tab w:val="right" w:leader="dot" w:pos="9345"/>
             </w:tabs>
             <w:rPr>
+              <w:rFonts w:eastAsiaTheme="minorEastAsia"/>
               <w:noProof/>
+              <w:lang w:eastAsia="ru-RU"/>
             </w:rPr>
           </w:pPr>
-          <w:hyperlink w:anchor="_Toc206346799" w:history="1">
+          <w:hyperlink w:anchor="_Toc212746759" w:history="1">
             <w:r>
               <w:rPr>
                 <w:rStyle w:val="a5"/>
                 <w:noProof/>
               </w:rPr>
-              <w:t>Базовые еди</w:t>
-            </w:r>
-            <w:r>
-              <w:rPr>
-                <w:rStyle w:val="a5"/>
-                <w:noProof/>
-              </w:rPr>
-              <w:t>н</w:t>
-            </w:r>
-            <w:r>
-              <w:rPr>
-                <w:rStyle w:val="a5"/>
-                <w:noProof/>
-              </w:rPr>
-              <w:t>ицы</w:t>
+              <w:t>Базовые единицы</w:t>
             </w:r>
             <w:r>
               <w:rPr>
@@ -221,7 +231,7 @@
                 <w:noProof/>
                 <w:webHidden/>
               </w:rPr>
-              <w:instrText xml:space="preserve"> PAGEREF _Toc206346799 \h </w:instrText>
+              <w:instrText xml:space="preserve"> PAGEREF _Toc212746759 \h </w:instrText>
             </w:r>
             <w:r>
               <w:rPr>
@@ -259,30 +269,32 @@
               <w:tab w:val="right" w:leader="dot" w:pos="9345"/>
             </w:tabs>
             <w:rPr>
+              <w:rFonts w:eastAsiaTheme="minorEastAsia"/>
               <w:noProof/>
+              <w:lang w:eastAsia="ru-RU"/>
             </w:rPr>
           </w:pPr>
-          <w:hyperlink w:anchor="_Toc206346800" w:history="1">
+          <w:hyperlink w:anchor="_Toc212746760" w:history="1">
             <w:r>
               <w:rPr>
                 <w:rStyle w:val="a5"/>
                 <w:noProof/>
               </w:rPr>
-              <w:t>Трансформир</w:t>
+              <w:t>Трансф</w:t>
             </w:r>
             <w:r>
               <w:rPr>
                 <w:rStyle w:val="a5"/>
                 <w:noProof/>
               </w:rPr>
-              <w:t>у</w:t>
+              <w:t>о</w:t>
             </w:r>
             <w:r>
               <w:rPr>
                 <w:rStyle w:val="a5"/>
                 <w:noProof/>
               </w:rPr>
-              <w:t>емые единицы</w:t>
+              <w:t>рмируемые единицы</w:t>
             </w:r>
             <w:r>
               <w:rPr>
@@ -303,7 +315,7 @@
                 <w:noProof/>
                 <w:webHidden/>
               </w:rPr>
-              <w:instrText xml:space="preserve"> PAGEREF _Toc206346800 \h </w:instrText>
+              <w:instrText xml:space="preserve"> PAGEREF _Toc212746760 \h </w:instrText>
             </w:r>
             <w:r>
               <w:rPr>
@@ -341,10 +353,12 @@
               <w:tab w:val="right" w:leader="dot" w:pos="9345"/>
             </w:tabs>
             <w:rPr>
+              <w:rFonts w:eastAsiaTheme="minorEastAsia"/>
               <w:noProof/>
+              <w:lang w:eastAsia="ru-RU"/>
             </w:rPr>
           </w:pPr>
-          <w:hyperlink w:anchor="_Toc206346801" w:history="1">
+          <w:hyperlink w:anchor="_Toc212746761" w:history="1">
             <w:r>
               <w:rPr>
                 <w:rStyle w:val="a5"/>
@@ -371,7 +385,7 @@
                 <w:noProof/>
                 <w:webHidden/>
               </w:rPr>
-              <w:instrText xml:space="preserve"> PAGEREF _Toc206346801 \h </w:instrText>
+              <w:instrText xml:space="preserve"> PAGEREF _Toc212746761 \h </w:instrText>
             </w:r>
             <w:r>
               <w:rPr>
@@ -409,10 +423,12 @@
               <w:tab w:val="right" w:leader="dot" w:pos="9345"/>
             </w:tabs>
             <w:rPr>
+              <w:rFonts w:eastAsiaTheme="minorEastAsia"/>
               <w:noProof/>
+              <w:lang w:eastAsia="ru-RU"/>
             </w:rPr>
           </w:pPr>
-          <w:hyperlink w:anchor="_Toc206346802" w:history="1">
+          <w:hyperlink w:anchor="_Toc212746762" w:history="1">
             <w:r>
               <w:rPr>
                 <w:rStyle w:val="a5"/>
@@ -439,7 +455,7 @@
                 <w:noProof/>
                 <w:webHidden/>
               </w:rPr>
-              <w:instrText xml:space="preserve"> PAGEREF _Toc206346802 \h </w:instrText>
+              <w:instrText xml:space="preserve"> PAGEREF _Toc212746762 \h </w:instrText>
             </w:r>
             <w:r>
               <w:rPr>
@@ -477,10 +493,12 @@
               <w:tab w:val="right" w:leader="dot" w:pos="9345"/>
             </w:tabs>
             <w:rPr>
+              <w:rFonts w:eastAsiaTheme="minorEastAsia"/>
               <w:noProof/>
+              <w:lang w:eastAsia="ru-RU"/>
             </w:rPr>
           </w:pPr>
-          <w:hyperlink w:anchor="_Toc206346803" w:history="1">
+          <w:hyperlink w:anchor="_Toc212746763" w:history="1">
             <w:r>
               <w:rPr>
                 <w:rStyle w:val="a5"/>
@@ -507,7 +525,7 @@
                 <w:noProof/>
                 <w:webHidden/>
               </w:rPr>
-              <w:instrText xml:space="preserve"> PAGEREF _Toc206346803 \h </w:instrText>
+              <w:instrText xml:space="preserve"> PAGEREF _Toc212746763 \h </w:instrText>
             </w:r>
             <w:r>
               <w:rPr>
@@ -545,10 +563,12 @@
               <w:tab w:val="right" w:leader="dot" w:pos="9345"/>
             </w:tabs>
             <w:rPr>
+              <w:rFonts w:eastAsiaTheme="minorEastAsia"/>
               <w:noProof/>
+              <w:lang w:eastAsia="ru-RU"/>
             </w:rPr>
           </w:pPr>
-          <w:hyperlink w:anchor="_Toc206346804" w:history="1">
+          <w:hyperlink w:anchor="_Toc212746764" w:history="1">
             <w:r>
               <w:rPr>
                 <w:rStyle w:val="a5"/>
@@ -575,7 +595,147 @@
                 <w:noProof/>
                 <w:webHidden/>
               </w:rPr>
-              <w:instrText xml:space="preserve"> PAGEREF _Toc206346804 \h </w:instrText>
+              <w:instrText xml:space="preserve"> PAGEREF _Toc212746764 \h </w:instrText>
+            </w:r>
+            <w:r>
+              <w:rPr>
+                <w:noProof/>
+                <w:webHidden/>
+              </w:rPr>
+            </w:r>
+            <w:r>
+              <w:rPr>
+                <w:noProof/>
+                <w:webHidden/>
+              </w:rPr>
+              <w:fldChar w:fldCharType="separate"/>
+            </w:r>
+            <w:r>
+              <w:rPr>
+                <w:noProof/>
+                <w:webHidden/>
+              </w:rPr>
+              <w:t>4</w:t>
+            </w:r>
+            <w:r>
+              <w:rPr>
+                <w:noProof/>
+                <w:webHidden/>
+              </w:rPr>
+              <w:fldChar w:fldCharType="end"/>
+            </w:r>
+          </w:hyperlink>
+        </w:p>
+        <w:p>
+          <w:pPr>
+            <w:pStyle w:val="21"/>
+            <w:tabs>
+              <w:tab w:val="right" w:leader="dot" w:pos="9345"/>
+            </w:tabs>
+            <w:rPr>
+              <w:rFonts w:eastAsiaTheme="minorEastAsia"/>
+              <w:noProof/>
+              <w:lang w:eastAsia="ru-RU"/>
+            </w:rPr>
+          </w:pPr>
+          <w:hyperlink w:anchor="_Toc212746765" w:history="1">
+            <w:r>
+              <w:rPr>
+                <w:rStyle w:val="a5"/>
+                <w:noProof/>
+              </w:rPr>
+              <w:t>Модель единицы</w:t>
+            </w:r>
+            <w:r>
+              <w:rPr>
+                <w:noProof/>
+                <w:webHidden/>
+              </w:rPr>
+              <w:tab/>
+            </w:r>
+            <w:r>
+              <w:rPr>
+                <w:noProof/>
+                <w:webHidden/>
+              </w:rPr>
+              <w:fldChar w:fldCharType="begin"/>
+            </w:r>
+            <w:r>
+              <w:rPr>
+                <w:noProof/>
+                <w:webHidden/>
+              </w:rPr>
+              <w:instrText xml:space="preserve"> PAGEREF _Toc212746765 \h </w:instrText>
+            </w:r>
+            <w:r>
+              <w:rPr>
+                <w:noProof/>
+                <w:webHidden/>
+              </w:rPr>
+            </w:r>
+            <w:r>
+              <w:rPr>
+                <w:noProof/>
+                <w:webHidden/>
+              </w:rPr>
+              <w:fldChar w:fldCharType="separate"/>
+            </w:r>
+            <w:r>
+              <w:rPr>
+                <w:noProof/>
+                <w:webHidden/>
+              </w:rPr>
+              <w:t>4</w:t>
+            </w:r>
+            <w:r>
+              <w:rPr>
+                <w:noProof/>
+                <w:webHidden/>
+              </w:rPr>
+              <w:fldChar w:fldCharType="end"/>
+            </w:r>
+          </w:hyperlink>
+        </w:p>
+        <w:p>
+          <w:pPr>
+            <w:pStyle w:val="21"/>
+            <w:tabs>
+              <w:tab w:val="right" w:leader="dot" w:pos="9345"/>
+            </w:tabs>
+            <w:rPr>
+              <w:rFonts w:eastAsiaTheme="minorEastAsia"/>
+              <w:noProof/>
+              <w:lang w:eastAsia="ru-RU"/>
+            </w:rPr>
+          </w:pPr>
+          <w:hyperlink w:anchor="_Toc212746766" w:history="1">
+            <w:r>
+              <w:rPr>
+                <w:rStyle w:val="a5"/>
+                <w:noProof/>
+              </w:rPr>
+              <w:t>Модель смерти</w:t>
+            </w:r>
+            <w:r>
+              <w:rPr>
+                <w:noProof/>
+                <w:webHidden/>
+              </w:rPr>
+              <w:tab/>
+            </w:r>
+            <w:r>
+              <w:rPr>
+                <w:noProof/>
+                <w:webHidden/>
+              </w:rPr>
+              <w:fldChar w:fldCharType="begin"/>
+            </w:r>
+            <w:r>
+              <w:rPr>
+                <w:noProof/>
+                <w:webHidden/>
+              </w:rPr>
+              <w:instrText xml:space="preserve"> PAGEREF _Toc212746766 \h </w:instrText>
             </w:r>
             <w:r>
               <w:rPr>
@@ -613,10 +773,12 @@
               <w:tab w:val="right" w:leader="dot" w:pos="9345"/>
             </w:tabs>
             <w:rPr>
+              <w:rFonts w:eastAsiaTheme="minorEastAsia"/>
               <w:noProof/>
+              <w:lang w:eastAsia="ru-RU"/>
             </w:rPr>
           </w:pPr>
-          <w:hyperlink w:anchor="_Toc206346805" w:history="1">
+          <w:hyperlink w:anchor="_Toc212746767" w:history="1">
             <w:r>
               <w:rPr>
                 <w:rStyle w:val="a5"/>
@@ -643,7 +805,7 @@
                 <w:noProof/>
                 <w:webHidden/>
               </w:rPr>
-              <w:instrText xml:space="preserve"> PAGEREF _Toc206346805 \h </w:instrText>
+              <w:instrText xml:space="preserve"> PAGEREF _Toc212746767 \h </w:instrText>
             </w:r>
             <w:r>
               <w:rPr>
@@ -698,7 +860,7 @@
       <w:pPr>
         <w:pStyle w:val="1"/>
       </w:pPr>
-      <w:bookmarkStart w:id="0" w:name="_Toc206346798"/>
+      <w:bookmarkStart w:id="0" w:name="_Toc212746758"/>
       <w:r>
         <w:lastRenderedPageBreak/>
         <w:t>Единицы</w:t>
@@ -710,7 +872,7 @@
       <w:pPr>
         <w:pStyle w:val="2"/>
       </w:pPr>
-      <w:bookmarkStart w:id="1" w:name="_Toc206346799"/>
+      <w:bookmarkStart w:id="1" w:name="_Toc212746759"/>
       <w:r>
         <w:t>Базовые единицы</w:t>
       </w:r>
@@ -842,11 +1004,6 @@
       </w:r>
     </w:p>
     <w:p>
-      <w:pPr>
-        <w:rPr>
-          <w:lang w:val="en-US"/>
-        </w:rPr>
-      </w:pPr>
       <w:r>
         <w:rPr>
           <w:lang w:val="en-US"/>
@@ -854,18 +1011,12 @@
         <w:t>ID</w:t>
       </w:r>
       <w:r>
-        <w:rPr>
-          <w:lang w:val="en-US"/>
-        </w:rPr>
         <w:t xml:space="preserve"> </w:t>
       </w:r>
       <w:r>
         <w:t>вида</w:t>
       </w:r>
       <w:r>
-        <w:rPr>
-          <w:lang w:val="en-US"/>
-        </w:rPr>
         <w:t xml:space="preserve">: </w:t>
       </w:r>
       <w:proofErr w:type="spellStart"/>
@@ -879,18 +1030,12 @@
       </w:r>
       <w:proofErr w:type="spellEnd"/>
     </w:p>
-    <w:p>
-      <w:pPr>
-        <w:rPr>
-          <w:lang w:val="en-US"/>
-        </w:rPr>
-      </w:pPr>
-    </w:p>
+    <w:p/>
     <w:p>
       <w:pPr>
         <w:pStyle w:val="2"/>
       </w:pPr>
-      <w:bookmarkStart w:id="2" w:name="_Toc206346800"/>
+      <w:bookmarkStart w:id="2" w:name="_Toc212746760"/>
       <w:r>
         <w:t>Трансформируемые</w:t>
       </w:r>
@@ -997,7 +1142,6 @@
         <w:rPr>
           <w:i/>
           <w:iCs/>
-          <w:lang w:val="en-US"/>
         </w:rPr>
       </w:pPr>
       <w:r>
@@ -1046,7 +1190,6 @@
         <w:rPr>
           <w:i/>
           <w:iCs/>
-          <w:lang w:val="en-US"/>
         </w:rPr>
       </w:pPr>
     </w:p>
@@ -1054,27 +1197,281 @@
       <w:pPr>
         <w:pStyle w:val="2"/>
       </w:pPr>
-      <w:bookmarkStart w:id="3" w:name="_Toc206346801"/>
+      <w:bookmarkStart w:id="3" w:name="_Toc212746761"/>
       <w:r>
         <w:t>Закопанные единицы</w:t>
       </w:r>
       <w:bookmarkEnd w:id="3"/>
     </w:p>
+    <w:p>
+      <w:pPr>
+        <w:rPr>
+          <w:i/>
+          <w:iCs/>
+        </w:rPr>
+      </w:pPr>
+      <w:r>
+        <w:t>Единицы</w:t>
+      </w:r>
+      <w:r>
+        <w:t xml:space="preserve">, </w:t>
+      </w:r>
+      <w:r>
+        <w:t xml:space="preserve">которые имеют флаги </w:t>
+      </w:r>
+      <w:r>
+        <w:rPr>
+          <w:b/>
+          <w:bCs/>
+          <w:lang w:val="en-US"/>
+        </w:rPr>
+        <w:t>Cloaked</w:t>
+      </w:r>
+      <w:r>
+        <w:rPr>
+          <w:b/>
+          <w:bCs/>
+        </w:rPr>
+        <w:t xml:space="preserve"> </w:t>
+      </w:r>
+      <w:r>
+        <w:t xml:space="preserve">и </w:t>
+      </w:r>
+      <w:proofErr w:type="spellStart"/>
+      <w:r>
+        <w:rPr>
+          <w:b/>
+          <w:bCs/>
+          <w:lang w:val="en-US"/>
+        </w:rPr>
+        <w:t>Burried</w:t>
+      </w:r>
+      <w:proofErr w:type="spellEnd"/>
+      <w:r>
+        <w:t xml:space="preserve">, </w:t>
+      </w:r>
+      <w:r>
+        <w:t>такие как</w:t>
+      </w:r>
+      <w:r>
+        <w:t xml:space="preserve">: </w:t>
+      </w:r>
+      <w:r>
+        <w:rPr>
+          <w:i/>
+          <w:iCs/>
+        </w:rPr>
+        <w:t>Закопанный</w:t>
+      </w:r>
+      <w:r>
+        <w:rPr>
+          <w:i/>
+          <w:iCs/>
+        </w:rPr>
+        <w:t xml:space="preserve"> </w:t>
+      </w:r>
+      <w:proofErr w:type="spellStart"/>
+      <w:r>
+        <w:rPr>
+          <w:i/>
+          <w:iCs/>
+        </w:rPr>
+        <w:t>гиблинг</w:t>
+      </w:r>
+      <w:proofErr w:type="spellEnd"/>
+      <w:r>
+        <w:rPr>
+          <w:i/>
+          <w:iCs/>
+        </w:rPr>
+        <w:t>/</w:t>
+      </w:r>
+      <w:proofErr w:type="spellStart"/>
+      <w:r>
+        <w:rPr>
+          <w:i/>
+          <w:iCs/>
+        </w:rPr>
+        <w:t>зерглинг</w:t>
+      </w:r>
+      <w:proofErr w:type="spellEnd"/>
+      <w:r>
+        <w:rPr>
+          <w:i/>
+          <w:iCs/>
+        </w:rPr>
+        <w:t>/</w:t>
+      </w:r>
+      <w:r>
+        <w:rPr>
+          <w:i/>
+          <w:iCs/>
+        </w:rPr>
+        <w:t>Таракан</w:t>
+      </w:r>
+      <w:r>
+        <w:rPr>
+          <w:i/>
+          <w:iCs/>
+        </w:rPr>
+        <w:t>/</w:t>
+      </w:r>
+      <w:proofErr w:type="spellStart"/>
+      <w:r>
+        <w:rPr>
+          <w:i/>
+          <w:iCs/>
+        </w:rPr>
+        <w:t>Ультралиск</w:t>
+      </w:r>
+      <w:proofErr w:type="spellEnd"/>
+      <w:r>
+        <w:rPr>
+          <w:i/>
+          <w:iCs/>
+        </w:rPr>
+        <w:t>/</w:t>
+      </w:r>
+      <w:r>
+        <w:rPr>
+          <w:i/>
+          <w:iCs/>
+        </w:rPr>
+        <w:t>Мина вдова</w:t>
+      </w:r>
+    </w:p>
+    <w:p>
+      <w:pPr>
+        <w:rPr>
+          <w:i/>
+          <w:iCs/>
+        </w:rPr>
+      </w:pPr>
+    </w:p>
+    <w:p>
+      <w:r>
+        <w:t>Такие юниты вкладываются в коллекцию к основному юниту</w:t>
+      </w:r>
+      <w:r>
+        <w:t>,</w:t>
+      </w:r>
+      <w:r>
+        <w:t xml:space="preserve"> например</w:t>
+      </w:r>
+      <w:r>
+        <w:t xml:space="preserve">: </w:t>
+      </w:r>
+      <w:r>
+        <w:t xml:space="preserve">Закопанный </w:t>
+      </w:r>
+      <w:proofErr w:type="spellStart"/>
+      <w:r>
+        <w:t>Зерглинг</w:t>
+      </w:r>
+      <w:proofErr w:type="spellEnd"/>
+      <w:r>
+        <w:t xml:space="preserve">, </w:t>
+      </w:r>
+      <w:r>
+        <w:t xml:space="preserve">вкладывается в коллекцию обычного </w:t>
+      </w:r>
+      <w:proofErr w:type="spellStart"/>
+      <w:r>
+        <w:t>зерглинга</w:t>
+      </w:r>
+      <w:proofErr w:type="spellEnd"/>
+      <w:r>
+        <w:t>.</w:t>
+      </w:r>
+    </w:p>
+    <w:p>
+      <w:pPr>
+        <w:rPr>
+          <w:i/>
+          <w:iCs/>
+          <w:lang w:val="en-US"/>
+        </w:rPr>
+      </w:pPr>
+      <w:r>
+        <w:rPr>
+          <w:lang w:val="en-US"/>
+        </w:rPr>
+        <w:t xml:space="preserve">ID </w:t>
+      </w:r>
+      <w:r>
+        <w:t>вида</w:t>
+      </w:r>
+      <w:r>
+        <w:rPr>
+          <w:lang w:val="en-US"/>
+        </w:rPr>
+        <w:t xml:space="preserve">: </w:t>
+      </w:r>
+      <w:proofErr w:type="spellStart"/>
+      <w:r>
+        <w:rPr>
+          <w:lang w:val="en-US"/>
+        </w:rPr>
+        <w:t>DataCollectionID@Burrowed</w:t>
+      </w:r>
+      <w:proofErr w:type="spellEnd"/>
+    </w:p>
     <w:p/>
+    <w:p>
+      <w:pPr>
+        <w:pStyle w:val="2"/>
+      </w:pPr>
+      <w:bookmarkStart w:id="4" w:name="_Toc212746762"/>
+      <w:r>
+        <w:t>Снаряды</w:t>
+      </w:r>
+      <w:bookmarkEnd w:id="4"/>
+    </w:p>
     <w:p/>
     <w:p>
-      <w:pPr>
-        <w:pStyle w:val="2"/>
-      </w:pPr>
-      <w:bookmarkStart w:id="4" w:name="_Toc206346802"/>
-      <w:r>
-        <w:t>Снаряды</w:t>
-      </w:r>
-      <w:bookmarkEnd w:id="4"/>
+      <w:r>
+        <w:t>Единицы</w:t>
+      </w:r>
+      <w:r>
+        <w:t xml:space="preserve">, </w:t>
+      </w:r>
+      <w:r>
+        <w:t>запускаемые другими единицами любым способом в цель</w:t>
+      </w:r>
+      <w:r>
+        <w:t>.</w:t>
+      </w:r>
+    </w:p>
+    <w:p>
+      <w:r>
+        <w:t>Такие единицы вкладываются в ту коллекцию</w:t>
+      </w:r>
+      <w:r>
+        <w:t xml:space="preserve">, </w:t>
+      </w:r>
+      <w:r>
+        <w:t>для чего используется этот снаряд</w:t>
+      </w:r>
+      <w:r>
+        <w:t xml:space="preserve">, </w:t>
+      </w:r>
+      <w:r>
+        <w:t>например</w:t>
+      </w:r>
+      <w:r>
+        <w:t xml:space="preserve">: </w:t>
+      </w:r>
+      <w:r>
+        <w:t>Снаряды от оружий</w:t>
+      </w:r>
+      <w:r>
+        <w:t xml:space="preserve">, </w:t>
+      </w:r>
+      <w:r>
+        <w:t>вкладываются в коллекцию оружия</w:t>
+      </w:r>
     </w:p>
     <w:p/>
-    <w:p/>
-    <w:p/>
     <w:p>
       <w:pPr>
         <w:spacing w:line="259" w:lineRule="auto"/>
@@ -1087,7 +1484,7 @@
       <w:pPr>
         <w:pStyle w:val="1"/>
       </w:pPr>
-      <w:bookmarkStart w:id="5" w:name="_Toc206346803"/>
+      <w:bookmarkStart w:id="5" w:name="_Toc212746763"/>
       <w:proofErr w:type="spellStart"/>
       <w:r>
         <w:lastRenderedPageBreak/>
@@ -1114,12 +1511,268 @@
       <w:pPr>
         <w:pStyle w:val="1"/>
       </w:pPr>
-      <w:bookmarkStart w:id="6" w:name="_Toc206346804"/>
+      <w:bookmarkStart w:id="6" w:name="_Toc212746764"/>
       <w:r>
         <w:lastRenderedPageBreak/>
         <w:t>Модели</w:t>
       </w:r>
       <w:bookmarkEnd w:id="6"/>
+    </w:p>
+    <w:p/>
+    <w:p>
+      <w:pPr>
+        <w:pStyle w:val="2"/>
+      </w:pPr>
+      <w:bookmarkStart w:id="7" w:name="_Toc212746765"/>
+      <w:r>
+        <w:t>Модель единицы</w:t>
+      </w:r>
+      <w:bookmarkEnd w:id="7"/>
+    </w:p>
+    <w:p>
+      <w:r>
+        <w:t xml:space="preserve">Модель единицы от родителя </w:t>
+      </w:r>
+      <w:r>
+        <w:rPr>
+          <w:i/>
+          <w:iCs/>
+        </w:rPr>
+        <w:t>“</w:t>
+      </w:r>
+      <w:r>
+        <w:rPr>
+          <w:i/>
+          <w:iCs/>
+          <w:lang w:val="en-US"/>
+        </w:rPr>
+        <w:t>Unit</w:t>
+      </w:r>
+      <w:r>
+        <w:rPr>
+          <w:i/>
+          <w:iCs/>
+        </w:rPr>
+        <w:t xml:space="preserve">” </w:t>
+      </w:r>
+      <w:r>
+        <w:t xml:space="preserve">должна иметь вид </w:t>
+      </w:r>
+      <w:r>
+        <w:rPr>
+          <w:lang w:val="en-US"/>
+        </w:rPr>
+        <w:t>ID</w:t>
+      </w:r>
+      <w:r>
+        <w:t xml:space="preserve"> </w:t>
+      </w:r>
+      <w:r>
+        <w:t>как</w:t>
+      </w:r>
+      <w:r>
+        <w:t xml:space="preserve">: </w:t>
+      </w:r>
+      <w:proofErr w:type="spellStart"/>
+      <w:r>
+        <w:rPr>
+          <w:lang w:val="en-US"/>
+        </w:rPr>
+        <w:t>DataCollectionID</w:t>
+      </w:r>
+      <w:proofErr w:type="spellEnd"/>
+    </w:p>
+    <w:p>
+      <w:pPr>
+        <w:pStyle w:val="2"/>
+      </w:pPr>
+      <w:bookmarkStart w:id="8" w:name="_Toc212746766"/>
+      <w:r>
+        <w:t>Модель смерти</w:t>
+      </w:r>
+      <w:bookmarkEnd w:id="8"/>
+    </w:p>
+    <w:p>
+      <w:pPr>
+        <w:rPr>
+          <w:lang w:val="en-US"/>
+        </w:rPr>
+      </w:pPr>
+      <w:r>
+        <w:t xml:space="preserve">Модель смерти от родителя </w:t>
+      </w:r>
+      <w:r>
+        <w:t>“</w:t>
+      </w:r>
+      <w:r>
+        <w:rPr>
+          <w:lang w:val="en-US"/>
+        </w:rPr>
+        <w:t>Unit</w:t>
+      </w:r>
+      <w:r>
+        <w:t xml:space="preserve">” </w:t>
+      </w:r>
+      <w:r>
+        <w:t xml:space="preserve">должна иметь вид </w:t>
+      </w:r>
+      <w:r>
+        <w:rPr>
+          <w:lang w:val="en-US"/>
+        </w:rPr>
+        <w:t>ID</w:t>
+      </w:r>
+      <w:r>
+        <w:t xml:space="preserve"> </w:t>
+      </w:r>
+      <w:r>
+        <w:t>как</w:t>
+      </w:r>
+      <w:r>
+        <w:t xml:space="preserve">: </w:t>
+      </w:r>
+      <w:proofErr w:type="spellStart"/>
+      <w:r>
+        <w:rPr>
+          <w:lang w:val="en-US"/>
+        </w:rPr>
+        <w:t>DataCollectionID</w:t>
+      </w:r>
+      <w:proofErr w:type="spellEnd"/>
+      <w:r>
+        <w:t>@</w:t>
+      </w:r>
+      <w:r>
+        <w:rPr>
+          <w:lang w:val="en-US"/>
+        </w:rPr>
+        <w:t>Death</w:t>
+      </w:r>
+    </w:p>
+    <w:p>
+      <w:r>
+        <w:t>Также ниже приведён список моделей от других типов смертей</w:t>
+      </w:r>
+      <w:r>
+        <w:t>:</w:t>
+      </w:r>
+    </w:p>
+    <w:p>
+      <w:r>
+        <w:t>Смерть от кислоты</w:t>
+      </w:r>
+      <w:r>
+        <w:t xml:space="preserve"> (</w:t>
+      </w:r>
+      <w:r>
+        <w:rPr>
+          <w:lang w:val="en-US"/>
+        </w:rPr>
+        <w:t>Acid</w:t>
+      </w:r>
+      <w:r>
+        <w:t xml:space="preserve">): </w:t>
+      </w:r>
+      <w:proofErr w:type="spellStart"/>
+      <w:r>
+        <w:rPr>
+          <w:lang w:val="en-US"/>
+        </w:rPr>
+        <w:t>DataCollectionID</w:t>
+      </w:r>
+      <w:proofErr w:type="spellEnd"/>
+      <w:r>
+        <w:t>@</w:t>
+      </w:r>
+      <w:proofErr w:type="spellStart"/>
+      <w:r>
+        <w:rPr>
+          <w:lang w:val="en-US"/>
+        </w:rPr>
+        <w:t>Death</w:t>
+      </w:r>
+      <w:r>
+        <w:rPr>
+          <w:lang w:val="en-US"/>
+        </w:rPr>
+        <w:t>Disintegrated</w:t>
+      </w:r>
+      <w:proofErr w:type="spellEnd"/>
+    </w:p>
+    <w:p>
+      <w:r>
+        <w:t>Смерть от Залпа (</w:t>
+      </w:r>
+      <w:r>
+        <w:rPr>
+          <w:lang w:val="en-US"/>
+        </w:rPr>
+        <w:t>Blast</w:t>
+      </w:r>
+      <w:r>
+        <w:t>)</w:t>
+      </w:r>
+      <w:r>
+        <w:t xml:space="preserve">: </w:t>
+      </w:r>
+      <w:proofErr w:type="spellStart"/>
+      <w:r>
+        <w:rPr>
+          <w:lang w:val="en-US"/>
+        </w:rPr>
+        <w:t>DataCollectionID</w:t>
+      </w:r>
+      <w:proofErr w:type="spellEnd"/>
+      <w:r>
+        <w:t>@</w:t>
+      </w:r>
+      <w:proofErr w:type="spellStart"/>
+      <w:r>
+        <w:rPr>
+          <w:lang w:val="en-US"/>
+        </w:rPr>
+        <w:t>Death</w:t>
+      </w:r>
+      <w:r>
+        <w:rPr>
+          <w:lang w:val="en-US"/>
+        </w:rPr>
+        <w:t>Blast</w:t>
+      </w:r>
+      <w:proofErr w:type="spellEnd"/>
+    </w:p>
+    <w:p>
+      <w:r>
+        <w:t>Смерть от потрошения</w:t>
+      </w:r>
+      <w:r>
+        <w:t xml:space="preserve">: </w:t>
+      </w:r>
+      <w:proofErr w:type="spellStart"/>
+      <w:r>
+        <w:rPr>
+          <w:lang w:val="en-US"/>
+        </w:rPr>
+        <w:t>DataCollectionID</w:t>
+      </w:r>
+      <w:proofErr w:type="spellEnd"/>
+      <w:r>
+        <w:t>@</w:t>
+      </w:r>
+      <w:proofErr w:type="spellStart"/>
+      <w:r>
+        <w:rPr>
+          <w:lang w:val="en-US"/>
+        </w:rPr>
+        <w:t>Death</w:t>
+      </w:r>
+      <w:r>
+        <w:rPr>
+          <w:lang w:val="en-US"/>
+        </w:rPr>
+        <w:t>Eviscerate</w:t>
+      </w:r>
+      <w:proofErr w:type="spellEnd"/>
     </w:p>
     <w:p>
       <w:pPr>
@@ -1139,12 +1792,12 @@
       <w:pPr>
         <w:pStyle w:val="1"/>
       </w:pPr>
-      <w:bookmarkStart w:id="7" w:name="_Toc206346805"/>
+      <w:bookmarkStart w:id="9" w:name="_Toc212746767"/>
       <w:r>
         <w:lastRenderedPageBreak/>
         <w:t>Звуки</w:t>
       </w:r>
-      <w:bookmarkEnd w:id="7"/>
+      <w:bookmarkEnd w:id="9"/>
     </w:p>
     <w:sectPr>
       <w:pgSz w:w="11906" w:h="16838"/>

</xml_diff>